<commit_message>
Standout pattern proposer: the wide adaptive pool all_p2s1A as a dated follow-up (notebook section 4b, paired per molecule from the merged record; results.json; report paragraph; PROVENANCE, README) — S5 fails (24–29 % on n_half, 42–50 % at K_off 0.3), the prediction 'feedback closes a third of the log-gap' fails (9–12 %); earlier sections stay as run
Co-Authored-By: Claude Fable 5.1 <noreply@anthropic.com>
</commit_message>
<xml_diff>
--- a/plans/05_delta-probed-ir-pipeline/modules/standout_pattern_proposer/Pattern_Proposer_Report.docx
+++ b/plans/05_delta-probed-ir-pipeline/modules/standout_pattern_proposer/Pattern_Proposer_Report.docx
@@ -40,7 +40,7 @@
           <w:i w:val="0"/>
           <w:sz w:val="20"/>
         </w:rPr>
-        <w:t>Frederic Petrignani — results of 2026-09-27 08:56; proxy-level (DFT against DFT) throughout</w:t>
+        <w:t>Frederic Petrignani — results of 2026-09-28 18:26; proxy-level (DFT against DFT) throughout</w:t>
       </w:r>
     </w:p>
     <w:p/>
@@ -625,6 +625,15 @@
           <w:i w:val="0"/>
         </w:rPr>
         <w:t>Adaptive ordering (band pool, paired per molecule). Feedback alone helps the blind order: P0+A is strictly better than P0 on 71 % of the parents with a median ratio of 0.82. On top of a scorer it improves the whole curve (AUC better on 100 % of molecules, median ratio 0.91) but not the halfway point (strictly better on 24 %, equal on 63 %). The registered pass line fails on n_half and passes on the AUC; the prediction that feedback would close a third of the gap to the oracle fails. The gap is knowledge the scorer lacks, not feedback it is denied.</w:t>
+      </w:r>
+    </w:p>
+    <w:p>
+      <w:r>
+        <w:rPr>
+          <w:b w:val="0"/>
+          <w:i w:val="0"/>
+        </w:rPr>
+        <w:t>Adaptive ordering, wide pool (follow-up of 28 September 2026). On the all-pairs candidate set the same paired test gives: P0+A against P0 a median ratio of 0.73 on the parents (strictly better on 78 %) and 0.72 on the substituted molecules; P1+A against P1 a median of 1.00, strictly better on 24–29 % of the parents (pass line 70 %: fails), and the AUC gain of the band pool is gone (median AUC ratio 0.99). Feedback closes 12 % of the log-gap from P1 to the oracle on the parents against a predicted third. What the adaptive loop can learn from the reconstruction, the scorer already knows before the first measurement; the lever is a better scorer, not an adaptive campaign, and the adaptive variants stay in the code as a measured negative.</w:t>
       </w:r>
     </w:p>
     <w:p>

</xml_diff>

<commit_message>
Lay-reader pass, standout (TASKS 20, decision 58): plain-language opening in README, notebook builder and executed notebook markdown, and report; glossary linked; report rebuilt, notebook re-executed after the TZ run
Co-Authored-By: Claude Fable 5.1 <noreply@anthropic.com>
</commit_message>
<xml_diff>
--- a/plans/05_delta-probed-ir-pipeline/modules/standout_pattern_proposer/Pattern_Proposer_Report.docx
+++ b/plans/05_delta-probed-ir-pipeline/modules/standout_pattern_proposer/Pattern_Proposer_Report.docx
@@ -63,6 +63,15 @@
           <w:i w:val="0"/>
         </w:rPr>
         <w:t>Every molecule of the pipeline has a table of vibrational couplings that we can only afford to know in part: each entry costs an expensive coupled-cluster energy. The recovery reconstructs the table from a small number of pattern responses and stops when its held-out residual is low enough. This module asks whether a network that has only seen other molecules can choose the order of measurement better than the fixed recipe, and, once the first experiment was read, whether the recipe's candidate list should reach every pair of modes at all. It is a simulation with no new quantum chemistry: the corpus's cheap-against-cheap Hessians give the full table for 289 molecules, hence the exact response of any pattern.</w:t>
+      </w:r>
+    </w:p>
+    <w:p>
+      <w:r>
+        <w:rPr>
+          <w:b w:val="0"/>
+          <w:i w:val="0"/>
+        </w:rPr>
+        <w:t>For a reader without chemistry: The expensive calculations that anchor this project can be done in pieces: each piece (a 'pattern') costs one energy evaluation and reveals part of the table of couplings between vibrations. The question here is which pieces to measure first, so that the table is known after as few pieces as possible. 'Proxy level' means the rehearsal uses two cheap calculations standing in for the cheap and the expensive one; the test on real expensive responses is in sections 4c–4g. Terms are defined in ../../GLOSSARY.md.</w:t>
       </w:r>
     </w:p>
     <w:p>
@@ -705,7 +714,7 @@
           <w:b w:val="0"/>
           <w:i w:val="0"/>
         </w:rPr>
-        <w:t>Proxy level: the tables are two density functionals against each other, not against coupled cluster; the test on real responses (the anchor's naphthalene deck) comes after the 28th. The band pool's factor of five was largely the fixed recipe's blindness; on the pool that matters the ordering gain is 1.3–1.6×. The learned representation has not beaten the hand features at 175 training molecules; the next stages (data growth, pretraining, the cheap-estimate input) are registered with their pass lines.</w:t>
+        <w:t>Coupled-cluster level: the test on real responses ran on benzene (29 September) and naphthalene (4 October). On both, the order the scorer proposes halves to a fifth the number of energies the wide pool needs on the real CC correction (P1/oracle 5.0 on naphthalene), while inside the registered spectral band neither molecule shows a gain. The in-band requirement was withdrawn on 4 October as mis-specified — the proposer serves the whole correction, which is what the network learns — and the band-free read is the registered line; both molecules pass it. The band pool's factor of five on the proxy was largely the fixed recipe's blindness; on the pool that matters the ordering gain is 1.3–1.6×. The learned representation has not beaten the hand features at 175 training molecules; the next stages (data growth, pretraining, the cheap-estimate input) are registered with their pass lines.</w:t>
       </w:r>
     </w:p>
     <w:p>

</xml_diff>